<commit_message>
Rename manuscript file per VR edits + save all changes
Co-Authored-By: Claude Opus 4.6 (1M context) <noreply@anthropic.com>
</commit_message>
<xml_diff>
--- a/manuscript_versions/Ravichandran_npjPO_v3_VR_edits_18Apr2026.docx
+++ b/manuscript_versions/Ravichandran_npjPO_v3_VR_edits_18Apr2026.docx
@@ -101,15 +101,27 @@
       </w:r>
     </w:p>
     <w:p>
-      <w:r>
-        <w:t xml:space="preserve">Lung cancer remains the leading cause of cancer death worldwide. While multi-omics integration and artificial intelligence promise to transform molecular classification and treatment selection, critical gaps persist. </w:t>
-      </w:r>
-      <w:r>
-        <w:t xml:space="preserve">In this review </w:t>
-      </w:r>
-      <w:r>
-        <w:t>across 12 thematic domains and conducted a focused census of 25 multi-omics integration studies in lung cancer. We identify a fundamental methodological divide: 72% of studies use the MOVICS framework, 88% depend on TCGA data, and the majority employ survival-based feature selection that collapses biological heterogeneity into binary risk categories. Sex-stratified and never-smoker-focused multi-omics analyses are virtually absent. No study integrates clinical features as competing inputs alongside molecular data. Zero studies are prospective, and zero have produced companion diagnostics. We propose a hierarchical framework that preserves biological taxonomy while enabling clinical risk stratification, and outline priorities for closing these translational gaps.</w:t>
-      </w:r>
+      <w:pPr>
+        <w:rPr>
+          <w:del w:id="0" w:author="Vignesh Ravichandran" w:date="2026-04-19T19:07:00Z" w16du:dateUtc="2026-04-19T23:07:00Z"/>
+        </w:rPr>
+      </w:pPr>
+      <w:ins w:id="1" w:author="Vignesh Ravichandran" w:date="2026-04-19T19:07:00Z" w16du:dateUtc="2026-04-19T23:07:00Z">
+        <w:r>
+          <w:t>Lung cancer remains the leading cause of cancer death worldwide. Multi-omics integration and artificial intelligence have advanced molecular classification, yet critical gaps prevent clinical translation. Current subtype classifications fail to capture the heterogeneity of non-small cell lung cancer, particularly in never-smokers and women, who exhibit distinct mutational landscapes and remain underrepresented in genomic studies. While proteogenomic profiling has revealed druggable targets invisible to genomics alone, and deep learning models can predict molecular alterations from histopathology, these advances have not reached clinical practice. Key barriers include reliance on single-cohort retrospective data, absence of sex-stratified and never-smoker-focused analyses, limited integration of clinical with molecular features, and methodological choices that sacrifice biological resolution for prognostic convenience. Here, we review the current landscape of multi-omics and AI/ML in lung cancer across molecular heterogeneity, integration methods, population stratification, immune biomarkers, translational gaps, and emerging technologies, and propose priorities for achieving clinically actionable precision oncology.</w:t>
+        </w:r>
+      </w:ins>
+      <w:del w:id="2" w:author="Vignesh Ravichandran" w:date="2026-04-19T19:07:00Z" w16du:dateUtc="2026-04-19T23:07:00Z">
+        <w:r>
+          <w:delText xml:space="preserve">Lung cancer remains the leading cause of cancer death worldwide. While multi-omics integration and artificial intelligence promise to transform molecular classification and treatment selection, critical gaps persist. </w:delText>
+        </w:r>
+        <w:r>
+          <w:delText xml:space="preserve">In this review </w:delText>
+        </w:r>
+        <w:r>
+          <w:delText>across 12 thematic domains and conducted a focused census of 25 multi-omics integration studies in lung cancer. We identify a fundamental methodological divide: 72% of studies use the MOVICS framework, 88% depend on TCGA data, and the majority employ survival-based feature selection that collapses biological heterogeneity into binary risk categories. Sex-stratified and never-smoker-focused multi-omics analyses are virtually absent. No study integrates clinical features as competing inputs alongside molecular data. Zero studies are prospective, and zero have produced companion diagnostics. We propose a hierarchical framework that preserves biological taxonomy while enabling clinical risk stratification, and outline priorities for closing these translational gaps.</w:delText>
+        </w:r>
+      </w:del>
     </w:p>
     <w:p>
       <w:r>
@@ -129,50 +141,50 @@
       <w:r>
         <w:t xml:space="preserve">Lung cancer is the most commonly diagnosed malignancy and the leading cause of cancer mortality worldwide, accounting for approximately 1.8 million deaths </w:t>
       </w:r>
-      <w:commentRangeStart w:id="0"/>
+      <w:commentRangeStart w:id="3"/>
       <w:r>
         <w:t xml:space="preserve">annually. </w:t>
       </w:r>
-      <w:commentRangeEnd w:id="0"/>
+      <w:commentRangeEnd w:id="3"/>
       <w:r>
         <w:rPr>
           <w:rStyle w:val="CommentReference"/>
           <w:sz w:val="22"/>
           <w:szCs w:val="22"/>
         </w:rPr>
-        <w:commentReference w:id="0"/>
+        <w:commentReference w:id="3"/>
       </w:r>
       <w:r>
         <w:t>Non-small cell lung cancer (NSCLC) constitutes roughly 85% of diagnoses, with lung adenocarcinoma (LUAD) representing approximately 40% and lung squamous cell carcinoma (LUSC) approximately 30% of c</w:t>
       </w:r>
-      <w:commentRangeStart w:id="1"/>
+      <w:commentRangeStart w:id="4"/>
       <w:r>
         <w:t>ases</w:t>
       </w:r>
-      <w:commentRangeEnd w:id="1"/>
+      <w:commentRangeEnd w:id="4"/>
       <w:r>
         <w:rPr>
           <w:rStyle w:val="CommentReference"/>
           <w:sz w:val="22"/>
           <w:szCs w:val="22"/>
         </w:rPr>
-        <w:commentReference w:id="1"/>
+        <w:commentReference w:id="4"/>
       </w:r>
       <w:r>
         <w:t xml:space="preserve">. Despite transformative advances in targeted therapy—including osimertinib for EGFR-mutant disease, sotorasib and adagrasib for KRAS G12C, and crizotinib and alectinib for ALK-rearranged tumors—and the broad deployment of immune checkpoint inhibitors such as pembrolizumab and atezolizumab, five-year survival remains a sobering 16–25% </w:t>
       </w:r>
-      <w:commentRangeStart w:id="2"/>
+      <w:commentRangeStart w:id="5"/>
       <w:r>
         <w:t>across stages.</w:t>
       </w:r>
-      <w:commentRangeEnd w:id="2"/>
+      <w:commentRangeEnd w:id="5"/>
       <w:r>
         <w:rPr>
           <w:rStyle w:val="CommentReference"/>
           <w:sz w:val="22"/>
           <w:szCs w:val="22"/>
         </w:rPr>
-        <w:commentReference w:id="2"/>
+        <w:commentReference w:id="5"/>
       </w:r>
       <w:r>
         <w:br/>
@@ -198,12 +210,12 @@
       <w:r>
         <w:br/>
       </w:r>
-      <w:del w:id="3" w:author="Vignesh Ravichandran" w:date="2026-04-18T21:31:00Z" w16du:dateUtc="2026-04-19T01:31:00Z">
+      <w:del w:id="6" w:author="Vignesh Ravichandran" w:date="2026-04-18T21:31:00Z" w16du:dateUtc="2026-04-19T01:31:00Z">
         <w:r>
           <w:delText xml:space="preserve">Yet translation has stalled. </w:delText>
         </w:r>
       </w:del>
-      <w:ins w:id="4" w:author="Vignesh Ravichandran" w:date="2026-04-18T21:31:00Z" w16du:dateUtc="2026-04-19T01:31:00Z">
+      <w:ins w:id="7" w:author="Vignesh Ravichandran" w:date="2026-04-18T21:31:00Z" w16du:dateUtc="2026-04-19T01:31:00Z">
         <w:r>
           <w:t xml:space="preserve">The clinical translation finds its challenges. </w:t>
         </w:r>
@@ -211,7 +223,7 @@
       <w:r>
         <w:t xml:space="preserve">Reproducibility failures, population bias, and the absence of prospective validation have prevented multi-omics and AI discoveries from reaching clinical practice. In this review, we </w:t>
       </w:r>
-      <w:del w:id="5" w:author="Vignesh Ravichandran" w:date="2026-04-18T21:31:00Z" w16du:dateUtc="2026-04-19T01:31:00Z">
+      <w:del w:id="8" w:author="Vignesh Ravichandran" w:date="2026-04-18T21:31:00Z" w16du:dateUtc="2026-04-19T01:31:00Z">
         <w:r>
           <w:delText xml:space="preserve">systematically analyzed 66,879 papers across 12 thematic domains and conducted a focused census of 25 multi-omics integration studies in lung cancer. We </w:delText>
         </w:r>
@@ -219,12 +231,12 @@
       <w:r>
         <w:t xml:space="preserve">identify a critical methodological divide in feature selection philosophy, document pervasive gaps in population representation, and propose a hierarchical </w:t>
       </w:r>
-      <w:del w:id="6" w:author="Vignesh Ravichandran" w:date="2026-04-18T21:31:00Z" w16du:dateUtc="2026-04-19T01:31:00Z">
+      <w:del w:id="9" w:author="Vignesh Ravichandran" w:date="2026-04-18T21:31:00Z" w16du:dateUtc="2026-04-19T01:31:00Z">
         <w:r>
           <w:delText>framework for</w:delText>
         </w:r>
       </w:del>
-      <w:ins w:id="7" w:author="Vignesh Ravichandran" w:date="2026-04-18T21:31:00Z" w16du:dateUtc="2026-04-19T01:31:00Z">
+      <w:ins w:id="10" w:author="Vignesh Ravichandran" w:date="2026-04-18T21:31:00Z" w16du:dateUtc="2026-04-19T01:31:00Z">
         <w:r>
           <w:t>integration</w:t>
         </w:r>
@@ -232,12 +244,12 @@
       <w:r>
         <w:t xml:space="preserve"> </w:t>
       </w:r>
-      <w:del w:id="8" w:author="Vignesh Ravichandran" w:date="2026-04-18T21:31:00Z" w16du:dateUtc="2026-04-19T01:31:00Z">
+      <w:del w:id="11" w:author="Vignesh Ravichandran" w:date="2026-04-18T21:31:00Z" w16du:dateUtc="2026-04-19T01:31:00Z">
         <w:r>
           <w:delText>integration</w:delText>
         </w:r>
       </w:del>
-      <w:ins w:id="9" w:author="Vignesh Ravichandran" w:date="2026-04-18T21:31:00Z" w16du:dateUtc="2026-04-19T01:31:00Z">
+      <w:ins w:id="12" w:author="Vignesh Ravichandran" w:date="2026-04-18T21:31:00Z" w16du:dateUtc="2026-04-19T01:31:00Z">
         <w:r>
           <w:t>framework</w:t>
         </w:r>
@@ -258,12 +270,12 @@
       <w:r>
         <w:t xml:space="preserve">The molecular landscape of lung cancer is defined by histology-specific driver events, co-mutation patterns that modify treatment response, and proteomic divergence from genomic predictions. In LUAD, TCGA profiling identified recurrent drivers in EGFR, KRAS, ALK, ROS1, and BRAF, alongside three transcriptional subtypes—terminal respiratory unit (TRU), proximal-inflammatory (PI), and proximal-proliferative (PP)—that correlate with clinical behavior and immune contexture [1]. LUSC, by contrast, is </w:t>
       </w:r>
-      <w:del w:id="10" w:author="Vignesh Ravichandran" w:date="2026-04-18T21:35:00Z" w16du:dateUtc="2026-04-19T01:35:00Z">
+      <w:del w:id="13" w:author="Vignesh Ravichandran" w:date="2026-04-18T21:35:00Z" w16du:dateUtc="2026-04-19T01:35:00Z">
         <w:r>
           <w:delText>dominat</w:delText>
         </w:r>
       </w:del>
-      <w:ins w:id="11" w:author="Vignesh Ravichandran" w:date="2026-04-18T21:35:00Z" w16du:dateUtc="2026-04-19T01:35:00Z">
+      <w:ins w:id="14" w:author="Vignesh Ravichandran" w:date="2026-04-18T21:35:00Z" w16du:dateUtc="2026-04-19T01:35:00Z">
         <w:r>
           <w:t>characteriz</w:t>
         </w:r>
@@ -271,7 +283,7 @@
       <w:r>
         <w:t xml:space="preserve">ed by near-universal TP53 mutation (&gt;90%), </w:t>
       </w:r>
-      <w:del w:id="12" w:author="Vignesh Ravichandran" w:date="2026-04-18T21:35:00Z" w16du:dateUtc="2026-04-19T01:35:00Z">
+      <w:del w:id="15" w:author="Vignesh Ravichandran" w:date="2026-04-18T21:35:00Z" w16du:dateUtc="2026-04-19T01:35:00Z">
         <w:r>
           <w:delText xml:space="preserve">amplifications in </w:delText>
         </w:r>
@@ -279,7 +291,7 @@
       <w:r>
         <w:t>FGFR1 and SOX2</w:t>
       </w:r>
-      <w:ins w:id="13" w:author="Vignesh Ravichandran" w:date="2026-04-18T21:35:00Z" w16du:dateUtc="2026-04-19T01:35:00Z">
+      <w:ins w:id="16" w:author="Vignesh Ravichandran" w:date="2026-04-18T21:35:00Z" w16du:dateUtc="2026-04-19T01:35:00Z">
         <w:r>
           <w:t xml:space="preserve"> amplifications</w:t>
         </w:r>
@@ -297,17 +309,17 @@
         <w:lastRenderedPageBreak/>
         <w:t xml:space="preserve">Co-mutation context profoundly shapes biology and treatment response. Skoulidis and Heymach </w:t>
       </w:r>
-      <w:ins w:id="14" w:author="Vignesh Ravichandran" w:date="2026-04-18T21:38:00Z" w16du:dateUtc="2026-04-19T01:38:00Z">
+      <w:ins w:id="17" w:author="Vignesh Ravichandran" w:date="2026-04-18T21:38:00Z" w16du:dateUtc="2026-04-19T01:38:00Z">
         <w:r>
           <w:t xml:space="preserve">[PMID </w:t>
         </w:r>
       </w:ins>
-      <w:ins w:id="15" w:author="Vignesh Ravichandran" w:date="2026-04-18T21:38:00Z">
+      <w:ins w:id="18" w:author="Vignesh Ravichandran" w:date="2026-04-18T21:38:00Z">
         <w:r>
           <w:t>26069186</w:t>
         </w:r>
       </w:ins>
-      <w:ins w:id="16" w:author="Vignesh Ravichandran" w:date="2026-04-18T21:38:00Z" w16du:dateUtc="2026-04-19T01:38:00Z">
+      <w:ins w:id="19" w:author="Vignesh Ravichandran" w:date="2026-04-18T21:38:00Z" w16du:dateUtc="2026-04-19T01:38:00Z">
         <w:r>
           <w:t xml:space="preserve">] </w:t>
         </w:r>
@@ -4667,7 +4679,7 @@
 
 <file path=word/comments.xml><?xml version="1.0" encoding="utf-8"?>
 <w:comments xmlns:wpc="http://schemas.microsoft.com/office/word/2010/wordprocessingCanvas" xmlns:cx="http://schemas.microsoft.com/office/drawing/2014/chartex" xmlns:cx1="http://schemas.microsoft.com/office/drawing/2015/9/8/chartex" xmlns:cx2="http://schemas.microsoft.com/office/drawing/2015/10/21/chartex" xmlns:cx3="http://schemas.microsoft.com/office/drawing/2016/5/9/chartex" xmlns:cx4="http://schemas.microsoft.com/office/drawing/2016/5/10/chartex" xmlns:cx5="http://schemas.microsoft.com/office/drawing/2016/5/11/chartex" xmlns:cx6="http://schemas.microsoft.com/office/drawing/2016/5/12/chartex" xmlns:cx7="http://schemas.microsoft.com/office/drawing/2016/5/13/chartex" xmlns:cx8="http://schemas.microsoft.com/office/drawing/2016/5/14/chartex" xmlns:mc="http://schemas.openxmlformats.org/markup-compatibility/2006" xmlns:aink="http://schemas.microsoft.com/office/drawing/2016/ink" xmlns:am3d="http://schemas.microsoft.com/office/drawing/2017/model3d" xmlns:o="urn:schemas-microsoft-com:office:office" xmlns:oel="http://schemas.microsoft.com/office/2019/extlst" xmlns:r="http://schemas.openxmlformats.org/officeDocument/2006/relationships" xmlns:m="http://schemas.openxmlformats.org/officeDocument/2006/math" xmlns:v="urn:schemas-microsoft-com:vml" xmlns:wp14="http://schemas.microsoft.com/office/word/2010/wordprocessingDrawing" xmlns:wp="http://schemas.openxmlformats.org/drawingml/2006/wordprocessingDrawing" xmlns:w10="urn:schemas-microsoft-com:office:word" xmlns:w="http://schemas.openxmlformats.org/wordprocessingml/2006/main" xmlns:w14="http://schemas.microsoft.com/office/word/2010/wordml" xmlns:w15="http://schemas.microsoft.com/office/word/2012/wordml" xmlns:w16cex="http://schemas.microsoft.com/office/word/2018/wordml/cex" xmlns:w16cid="http://schemas.microsoft.com/office/word/2016/wordml/cid" xmlns:w16="http://schemas.microsoft.com/office/word/2018/wordml" xmlns:w16du="http://schemas.microsoft.com/office/word/2023/wordml/word16du" xmlns:w16sdtdh="http://schemas.microsoft.com/office/word/2020/wordml/sdtdatahash" xmlns:w16sdtfl="http://schemas.microsoft.com/office/word/2024/wordml/sdtformatlock" xmlns:w16se="http://schemas.microsoft.com/office/word/2015/wordml/symex" xmlns:wpg="http://schemas.microsoft.com/office/word/2010/wordprocessingGroup" xmlns:wpi="http://schemas.microsoft.com/office/word/2010/wordprocessingInk" xmlns:wne="http://schemas.microsoft.com/office/word/2006/wordml" xmlns:wps="http://schemas.microsoft.com/office/word/2010/wordprocessingShape" mc:Ignorable="w14 w15 w16se w16cid w16 w16cex w16sdtdh w16sdtfl w16du wp14">
-  <w:comment w:id="0" w:author="Vignesh Ravichandran" w:date="2026-04-18T21:26:00Z" w:initials="VR">
+  <w:comment w:id="3" w:author="Vignesh Ravichandran" w:date="2026-04-18T21:26:00Z" w:initials="VR">
     <w:p>
       <w:r>
         <w:rPr>
@@ -4684,7 +4696,7 @@
       </w:r>
     </w:p>
   </w:comment>
-  <w:comment w:id="1" w:author="Vignesh Ravichandran" w:date="2026-04-18T21:28:00Z" w:initials="VR">
+  <w:comment w:id="4" w:author="Vignesh Ravichandran" w:date="2026-04-18T21:28:00Z" w:initials="VR">
     <w:p>
       <w:r>
         <w:rPr>
@@ -4701,7 +4713,7 @@
       </w:r>
     </w:p>
   </w:comment>
-  <w:comment w:id="2" w:author="Vignesh Ravichandran" w:date="2026-04-18T21:29:00Z" w:initials="VR">
+  <w:comment w:id="5" w:author="Vignesh Ravichandran" w:date="2026-04-18T21:29:00Z" w:initials="VR">
     <w:p>
       <w:r>
         <w:rPr>
@@ -5717,6 +5729,7 @@
   <w:style w:type="character" w:default="1" w:styleId="DefaultParagraphFont">
     <w:name w:val="Default Paragraph Font"/>
     <w:uiPriority w:val="1"/>
+    <w:semiHidden/>
     <w:unhideWhenUsed/>
   </w:style>
   <w:style w:type="table" w:default="1" w:styleId="TableNormal">

</xml_diff>